<commit_message>
Add GitHub repository link to final report
</commit_message>
<xml_diff>
--- a/deliverables/Concurrent_Data_Processing_System_APA7_Report.docx
+++ b/deliverables/Concurrent_Data_Processing_System_APA7_Report.docx
@@ -330,7 +330,7 @@
           <w:rFonts w:ascii="Times New Roman" w:hAnsi="Times New Roman"/>
           <w:sz w:val="24"/>
         </w:rPr>
-        <w:t>The publication-ready repository is located in the submitted data-processing-system folder. GitHub publishing requires re-authentication for the configured account; insert the resulting repository URL before final submission.</w:t>
+        <w:t>The complete source code, execution instructions, and report are available at https://github.com/siddharth2170/data-processing-system</w:t>
       </w:r>
     </w:p>
     <w:p>
@@ -1437,9 +1437,6 @@
     <w:qFormat/>
     <w:rsid w:val="00FC693F"/>
     <w:pPr>
-      <w:pBdr>
-        <w:bottom w:val="single" w:sz="8" w:space="4" w:color="4F81BD" w:themeColor="accent1"/>
-      </w:pBdr>
       <w:spacing w:after="300" w:line="240" w:lineRule="auto"/>
       <w:contextualSpacing/>
     </w:pPr>

</xml_diff>